<commit_message>
función que da nulo, fila y columna
</commit_message>
<xml_diff>
--- a/4_parciales/asignacion_modulos.docx
+++ b/4_parciales/asignacion_modulos.docx
@@ -496,6 +496,80 @@
           <w:lang w:val="es-ES"/>
         </w:rPr>
       </w:pPr>
+      <w:r>
+        <w:rPr>
+          <w:b/>
+          <w:bCs/>
+          <w:lang w:val="es-ES"/>
+        </w:rPr>
+        <w:t>Asistir a las dos asesorías</w:t>
+      </w:r>
+    </w:p>
+    <w:p>
+      <w:pPr>
+        <w:pStyle w:val="Prrafodelista"/>
+        <w:numPr>
+          <w:ilvl w:val="0"/>
+          <w:numId w:val="1"/>
+        </w:numPr>
+        <w:rPr>
+          <w:b/>
+          <w:bCs/>
+          <w:lang w:val="es-ES"/>
+        </w:rPr>
+      </w:pPr>
+      <w:r>
+        <w:rPr>
+          <w:b/>
+          <w:bCs/>
+          <w:lang w:val="es-ES"/>
+        </w:rPr>
+        <w:t xml:space="preserve">Hacer el video completo mostrando que sabe manejas vectores y matrices con Python </w:t>
+      </w:r>
+    </w:p>
+    <w:p>
+      <w:pPr>
+        <w:pStyle w:val="Prrafodelista"/>
+        <w:numPr>
+          <w:ilvl w:val="0"/>
+          <w:numId w:val="1"/>
+        </w:numPr>
+        <w:rPr>
+          <w:b/>
+          <w:bCs/>
+          <w:lang w:val="es-ES"/>
+        </w:rPr>
+      </w:pPr>
+      <w:r>
+        <w:rPr>
+          <w:b/>
+          <w:bCs/>
+          <w:lang w:val="es-ES"/>
+        </w:rPr>
+        <w:t xml:space="preserve">Mostrar claramente, en el video, la aplicación de los conceptos de módulo a la ingeniería agropecuaria. </w:t>
+      </w:r>
+    </w:p>
+    <w:p>
+      <w:pPr>
+        <w:pStyle w:val="Prrafodelista"/>
+        <w:numPr>
+          <w:ilvl w:val="0"/>
+          <w:numId w:val="1"/>
+        </w:numPr>
+        <w:rPr>
+          <w:b/>
+          <w:bCs/>
+          <w:lang w:val="es-ES"/>
+        </w:rPr>
+      </w:pPr>
+      <w:r>
+        <w:rPr>
+          <w:b/>
+          <w:bCs/>
+          <w:lang w:val="es-ES"/>
+        </w:rPr>
+        <w:t xml:space="preserve">Exponer en el auditorio en 10 minutos la síntesis de su módulo. </w:t>
+      </w:r>
     </w:p>
     <w:p>
       <w:pPr>

</xml_diff>

<commit_message>
empecé el diseño de la clase pertinente al agro para módulo 7
</commit_message>
<xml_diff>
--- a/4_parciales/asignacion_modulos.docx
+++ b/4_parciales/asignacion_modulos.docx
@@ -583,9 +583,407 @@
     <w:p>
       <w:pPr>
         <w:rPr>
-          <w:lang w:val="es-ES"/>
-        </w:rPr>
-      </w:pPr>
+          <w:b/>
+          <w:bCs/>
+          <w:lang w:val="es-ES"/>
+        </w:rPr>
+      </w:pPr>
+    </w:p>
+    <w:p>
+      <w:pPr>
+        <w:rPr>
+          <w:b/>
+          <w:bCs/>
+          <w:lang w:val="es-ES"/>
+        </w:rPr>
+      </w:pPr>
+    </w:p>
+    <w:p>
+      <w:pPr>
+        <w:rPr>
+          <w:b/>
+          <w:bCs/>
+          <w:lang w:val="es-ES"/>
+        </w:rPr>
+      </w:pPr>
+    </w:p>
+    <w:p>
+      <w:pPr>
+        <w:rPr>
+          <w:b/>
+          <w:bCs/>
+          <w:lang w:val="es-ES"/>
+        </w:rPr>
+      </w:pPr>
+    </w:p>
+    <w:p>
+      <w:pPr>
+        <w:rPr>
+          <w:b/>
+          <w:bCs/>
+          <w:lang w:val="es-ES"/>
+        </w:rPr>
+      </w:pPr>
+    </w:p>
+    <w:p>
+      <w:pPr>
+        <w:rPr>
+          <w:b/>
+          <w:bCs/>
+          <w:lang w:val="es-ES"/>
+        </w:rPr>
+      </w:pPr>
+    </w:p>
+    <w:p>
+      <w:pPr>
+        <w:rPr>
+          <w:b/>
+          <w:bCs/>
+          <w:lang w:val="es-ES"/>
+        </w:rPr>
+      </w:pPr>
+    </w:p>
+    <w:p>
+      <w:pPr>
+        <w:rPr>
+          <w:b/>
+          <w:bCs/>
+          <w:lang w:val="es-ES"/>
+        </w:rPr>
+      </w:pPr>
+    </w:p>
+    <w:p>
+      <w:pPr>
+        <w:rPr>
+          <w:b/>
+          <w:bCs/>
+          <w:lang w:val="es-ES"/>
+        </w:rPr>
+      </w:pPr>
+    </w:p>
+    <w:p>
+      <w:pPr>
+        <w:rPr>
+          <w:b/>
+          <w:bCs/>
+          <w:lang w:val="es-ES"/>
+        </w:rPr>
+      </w:pPr>
+    </w:p>
+    <w:p>
+      <w:pPr>
+        <w:rPr>
+          <w:b/>
+          <w:bCs/>
+          <w:lang w:val="es-ES"/>
+        </w:rPr>
+      </w:pPr>
+    </w:p>
+    <w:p>
+      <w:pPr>
+        <w:rPr>
+          <w:lang w:val="es-ES"/>
+        </w:rPr>
+      </w:pPr>
+      <w:r>
+        <w:rPr>
+          <w:lang w:val="es-ES"/>
+        </w:rPr>
+        <w:lastRenderedPageBreak/>
+        <w:t># Estructura de cada Módulo (Total de módulos: 22)</w:t>
+      </w:r>
+    </w:p>
+    <w:p>
+      <w:pPr>
+        <w:rPr>
+          <w:lang w:val="es-ES"/>
+        </w:rPr>
+      </w:pPr>
+    </w:p>
+    <w:p>
+      <w:pPr>
+        <w:rPr>
+          <w:lang w:val="es-ES"/>
+        </w:rPr>
+      </w:pPr>
+      <w:r>
+        <w:rPr>
+          <w:lang w:val="es-ES"/>
+        </w:rPr>
+        <w:t>1. Título</w:t>
+      </w:r>
+    </w:p>
+    <w:p>
+      <w:pPr>
+        <w:rPr>
+          <w:lang w:val="es-ES"/>
+        </w:rPr>
+      </w:pPr>
+      <w:r>
+        <w:rPr>
+          <w:lang w:val="es-ES"/>
+        </w:rPr>
+        <w:t xml:space="preserve">2. Imagen introductoria generado con </w:t>
+      </w:r>
+      <w:proofErr w:type="spellStart"/>
+      <w:r>
+        <w:rPr>
+          <w:lang w:val="es-ES"/>
+        </w:rPr>
+        <w:t>Plotly</w:t>
+      </w:r>
+      <w:proofErr w:type="spellEnd"/>
+    </w:p>
+    <w:p>
+      <w:pPr>
+        <w:rPr>
+          <w:lang w:val="es-ES"/>
+        </w:rPr>
+      </w:pPr>
+      <w:r>
+        <w:rPr>
+          <w:lang w:val="es-ES"/>
+        </w:rPr>
+        <w:t>3. Contenido</w:t>
+      </w:r>
+    </w:p>
+    <w:p>
+      <w:pPr>
+        <w:rPr>
+          <w:lang w:val="es-ES"/>
+        </w:rPr>
+      </w:pPr>
+      <w:r>
+        <w:rPr>
+          <w:lang w:val="es-ES"/>
+        </w:rPr>
+        <w:t>4. Objetivos de aprendizaje</w:t>
+      </w:r>
+    </w:p>
+    <w:p>
+      <w:pPr>
+        <w:rPr>
+          <w:lang w:val="es-ES"/>
+        </w:rPr>
+      </w:pPr>
+      <w:r>
+        <w:rPr>
+          <w:lang w:val="es-ES"/>
+        </w:rPr>
+        <w:t>5. Preguntas Orientadoras</w:t>
+      </w:r>
+    </w:p>
+    <w:p>
+      <w:pPr>
+        <w:rPr>
+          <w:lang w:val="es-ES"/>
+        </w:rPr>
+      </w:pPr>
+      <w:r>
+        <w:rPr>
+          <w:lang w:val="es-ES"/>
+        </w:rPr>
+        <w:t>6. Introducción</w:t>
+      </w:r>
+    </w:p>
+    <w:p>
+      <w:pPr>
+        <w:rPr>
+          <w:lang w:val="es-ES"/>
+        </w:rPr>
+      </w:pPr>
+      <w:r>
+        <w:rPr>
+          <w:lang w:val="es-ES"/>
+        </w:rPr>
+        <w:t xml:space="preserve">7. Dos situaciones problemáticas asociadas a ciencia de datos agropecuarios o de Administración de Empresas y al tema del módulo en particular (Para el módulo 4: debes dar una situación donde se aplique el tema de dependencia e independencia lineal del Álgebra Lineal). Por ejemplo, datos asociados a mediciones en agricultura de precisión. </w:t>
+      </w:r>
+    </w:p>
+    <w:p>
+      <w:pPr>
+        <w:rPr>
+          <w:lang w:val="es-ES"/>
+        </w:rPr>
+      </w:pPr>
+      <w:r>
+        <w:rPr>
+          <w:lang w:val="es-ES"/>
+        </w:rPr>
+        <w:t>8. Genere,</w:t>
+      </w:r>
+      <w:r>
+        <w:rPr>
+          <w:lang w:val="es-ES"/>
+        </w:rPr>
+        <w:t xml:space="preserve"> con Python,</w:t>
+      </w:r>
+      <w:r>
+        <w:rPr>
+          <w:lang w:val="es-ES"/>
+        </w:rPr>
+        <w:t xml:space="preserve"> de manera artificial, los dos </w:t>
+      </w:r>
+      <w:proofErr w:type="spellStart"/>
+      <w:r>
+        <w:rPr>
+          <w:lang w:val="es-ES"/>
+        </w:rPr>
+        <w:t>datasets</w:t>
+      </w:r>
+      <w:proofErr w:type="spellEnd"/>
+      <w:r>
+        <w:rPr>
+          <w:lang w:val="es-ES"/>
+        </w:rPr>
+        <w:t xml:space="preserve"> asociados la </w:t>
+      </w:r>
+      <w:r>
+        <w:rPr>
+          <w:lang w:val="es-ES"/>
+        </w:rPr>
+        <w:t>situación</w:t>
+      </w:r>
+      <w:r>
+        <w:rPr>
+          <w:lang w:val="es-ES"/>
+        </w:rPr>
+        <w:t xml:space="preserve"> problemática anterior. </w:t>
+      </w:r>
+    </w:p>
+    <w:p>
+      <w:pPr>
+        <w:rPr>
+          <w:lang w:val="es-ES"/>
+        </w:rPr>
+      </w:pPr>
+      <w:r>
+        <w:rPr>
+          <w:lang w:val="es-ES"/>
+        </w:rPr>
+        <w:t>9.  Definiciones asociadas al módulo respectivo (Para este cuaderno el módulo 4: debes dar las definiciones en lenguaje Látex asociadas al tema de: "Dependencia e Independencia lineal" en Álgebra Lineal)</w:t>
+      </w:r>
+    </w:p>
+    <w:p>
+      <w:pPr>
+        <w:rPr>
+          <w:lang w:val="es-ES"/>
+        </w:rPr>
+      </w:pPr>
+      <w:r>
+        <w:rPr>
+          <w:lang w:val="es-ES"/>
+        </w:rPr>
+        <w:t>10. Ejemplos: (Genere ejemplos</w:t>
+      </w:r>
+      <w:r>
+        <w:rPr>
+          <w:lang w:val="es-ES"/>
+        </w:rPr>
+        <w:t xml:space="preserve"> de solución de las dos situaciones problemáticas </w:t>
+      </w:r>
+      <w:r>
+        <w:rPr>
+          <w:lang w:val="es-ES"/>
+        </w:rPr>
+        <w:t>anteriores)</w:t>
+      </w:r>
+    </w:p>
+    <w:p>
+      <w:pPr>
+        <w:rPr>
+          <w:lang w:val="es-ES"/>
+        </w:rPr>
+      </w:pPr>
+      <w:r>
+        <w:rPr>
+          <w:lang w:val="es-ES"/>
+        </w:rPr>
+        <w:t>11. Teoremas: (Genere los teoremas del álgebra lineal que facilitan el uso de los temas del módulo para la solución de la situación problemática.)</w:t>
+      </w:r>
+    </w:p>
+    <w:p>
+      <w:pPr>
+        <w:rPr>
+          <w:lang w:val="es-ES"/>
+        </w:rPr>
+      </w:pPr>
+      <w:r>
+        <w:rPr>
+          <w:lang w:val="es-ES"/>
+        </w:rPr>
+        <w:t xml:space="preserve">12. Ejemplos: (Genere ejemplos de aplicación de los teoremas para </w:t>
+      </w:r>
+      <w:r>
+        <w:rPr>
+          <w:lang w:val="es-ES"/>
+        </w:rPr>
+        <w:t xml:space="preserve">nuevos </w:t>
+      </w:r>
+      <w:proofErr w:type="spellStart"/>
+      <w:r>
+        <w:rPr>
+          <w:lang w:val="es-ES"/>
+        </w:rPr>
+        <w:t>datasets</w:t>
+      </w:r>
+      <w:proofErr w:type="spellEnd"/>
+      <w:r>
+        <w:rPr>
+          <w:lang w:val="es-ES"/>
+        </w:rPr>
+        <w:t xml:space="preserve"> </w:t>
+      </w:r>
+      <w:r>
+        <w:rPr>
+          <w:lang w:val="es-ES"/>
+        </w:rPr>
+        <w:t xml:space="preserve">asociados a </w:t>
+      </w:r>
+      <w:r>
+        <w:rPr>
+          <w:lang w:val="es-ES"/>
+        </w:rPr>
+        <w:t>situaciones problemáticas del módulo</w:t>
+      </w:r>
+      <w:r>
+        <w:rPr>
+          <w:lang w:val="es-ES"/>
+        </w:rPr>
+        <w:t xml:space="preserve"> asociadas al tema de este módulo</w:t>
+      </w:r>
+      <w:r>
+        <w:rPr>
+          <w:lang w:val="es-ES"/>
+        </w:rPr>
+        <w:t>)</w:t>
+      </w:r>
+    </w:p>
+    <w:p>
+      <w:pPr>
+        <w:rPr>
+          <w:lang w:val="es-ES"/>
+        </w:rPr>
+      </w:pPr>
+      <w:r>
+        <w:rPr>
+          <w:lang w:val="es-ES"/>
+        </w:rPr>
+        <w:t xml:space="preserve">13. Ejercicios (Genere ejercicios sugeridos con </w:t>
+      </w:r>
+      <w:proofErr w:type="spellStart"/>
+      <w:r>
+        <w:rPr>
+          <w:lang w:val="es-ES"/>
+        </w:rPr>
+        <w:t>dataset</w:t>
+      </w:r>
+      <w:proofErr w:type="spellEnd"/>
+      <w:r>
+        <w:rPr>
+          <w:lang w:val="es-ES"/>
+        </w:rPr>
+        <w:t xml:space="preserve"> artificiales nuevos)</w:t>
+      </w:r>
     </w:p>
     <w:sectPr>
       <w:pgSz w:w="12240" w:h="15840"/>

</xml_diff>

<commit_message>
terminé el diseño de la clase del módulo 7
</commit_message>
<xml_diff>
--- a/4_parciales/asignacion_modulos.docx
+++ b/4_parciales/asignacion_modulos.docx
@@ -796,7 +796,43 @@
         <w:rPr>
           <w:lang w:val="es-ES"/>
         </w:rPr>
-        <w:t xml:space="preserve">7. Dos situaciones problemáticas asociadas a ciencia de datos agropecuarios o de Administración de Empresas y al tema del módulo en particular (Para el módulo 4: debes dar una situación donde se aplique el tema de dependencia e independencia lineal del Álgebra Lineal). Por ejemplo, datos asociados a mediciones en agricultura de precisión. </w:t>
+        <w:t xml:space="preserve">7. Dos situaciones problemáticas asociadas a ciencia de datos agropecuarios o de Administración de Empresas y al tema del módulo en particular (Para el módulo </w:t>
+      </w:r>
+      <w:r>
+        <w:rPr>
+          <w:lang w:val="es-ES"/>
+        </w:rPr>
+        <w:t>7</w:t>
+      </w:r>
+      <w:r>
+        <w:rPr>
+          <w:lang w:val="es-ES"/>
+        </w:rPr>
+        <w:t>: debes dar una situación donde se aplique el tema de</w:t>
+      </w:r>
+      <w:r>
+        <w:rPr>
+          <w:lang w:val="es-ES"/>
+        </w:rPr>
+        <w:t>:</w:t>
+      </w:r>
+      <w:r>
+        <w:rPr>
+          <w:lang w:val="es-ES"/>
+        </w:rPr>
+        <w:t xml:space="preserve"> </w:t>
+      </w:r>
+      <w:r>
+        <w:rPr>
+          <w:lang w:val="es-ES"/>
+        </w:rPr>
+        <w:t>Coordenadas y Cambio de Base en</w:t>
+      </w:r>
+      <w:r>
+        <w:rPr>
+          <w:lang w:val="es-ES"/>
+        </w:rPr>
+        <w:t xml:space="preserve"> Álgebra Lineal). Por ejemplo, datos asociados a mediciones en agricultura de precisión. </w:t>
       </w:r>
     </w:p>
     <w:p>
@@ -860,7 +896,31 @@
         <w:rPr>
           <w:lang w:val="es-ES"/>
         </w:rPr>
-        <w:t>9.  Definiciones asociadas al módulo respectivo (Para este cuaderno el módulo 4: debes dar las definiciones en lenguaje Látex asociadas al tema de: "Dependencia e Independencia lineal" en Álgebra Lineal)</w:t>
+        <w:t xml:space="preserve">9.  Definiciones asociadas al módulo respectivo (Para este cuaderno el módulo </w:t>
+      </w:r>
+      <w:r>
+        <w:rPr>
+          <w:lang w:val="es-ES"/>
+        </w:rPr>
+        <w:t>7</w:t>
+      </w:r>
+      <w:r>
+        <w:rPr>
+          <w:lang w:val="es-ES"/>
+        </w:rPr>
+        <w:t>: debes dar las definiciones en lenguaje Látex asociadas al tema de: "</w:t>
+      </w:r>
+      <w:r>
+        <w:rPr>
+          <w:lang w:val="es-ES"/>
+        </w:rPr>
+        <w:t>Vectores Coordenados y Cambio de Base</w:t>
+      </w:r>
+      <w:r>
+        <w:rPr>
+          <w:lang w:val="es-ES"/>
+        </w:rPr>
+        <w:t>" en Álgebra Lineal)</w:t>
       </w:r>
     </w:p>
     <w:p>
@@ -985,6 +1045,18 @@
         <w:t xml:space="preserve"> artificiales nuevos)</w:t>
       </w:r>
     </w:p>
+    <w:p>
+      <w:r>
+        <w:rPr>
+          <w:lang w:val="es-ES"/>
+        </w:rPr>
+        <w:t xml:space="preserve">14. </w:t>
+      </w:r>
+      <w:r>
+        <w:t>Referentes Didácticos y del Álgebra Lineal que sustenten y apoyan esta propuesta de enseñanza.</w:t>
+      </w:r>
+    </w:p>
+    <w:p/>
     <w:sectPr>
       <w:pgSz w:w="12240" w:h="15840"/>
       <w:pgMar w:top="1417" w:right="1701" w:bottom="1417" w:left="1701" w:header="708" w:footer="708" w:gutter="0"/>
@@ -1695,7 +1767,6 @@
   <w:style w:type="character" w:default="1" w:styleId="Fuentedeprrafopredeter">
     <w:name w:val="Default Paragraph Font"/>
     <w:uiPriority w:val="1"/>
-    <w:semiHidden/>
     <w:unhideWhenUsed/>
   </w:style>
   <w:style w:type="table" w:default="1" w:styleId="Tablanormal">

</xml_diff>

<commit_message>
califiqué el parcial de mariana
</commit_message>
<xml_diff>
--- a/4_parciales/asignacion_modulos.docx
+++ b/4_parciales/asignacion_modulos.docx
@@ -453,6 +453,14 @@
                 <w:lang w:val="es-ES"/>
               </w:rPr>
             </w:pPr>
+            <w:r>
+              <w:rPr>
+                <w:b/>
+                <w:bCs/>
+                <w:lang w:val="es-ES"/>
+              </w:rPr>
+              <w:t>Leonardo y Laura</w:t>
+            </w:r>
           </w:p>
         </w:tc>
       </w:tr>
@@ -690,7 +698,7 @@
           <w:lang w:val="es-ES"/>
         </w:rPr>
         <w:lastRenderedPageBreak/>
-        <w:t># Estructura de cada Módulo (Total de módulos: 22)</w:t>
+        <w:t>Estructura de cada Módulo (Total de módulos: 22)</w:t>
       </w:r>
     </w:p>
     <w:p>
@@ -723,16 +731,8 @@
         <w:rPr>
           <w:lang w:val="es-ES"/>
         </w:rPr>
-        <w:t xml:space="preserve">2. Imagen introductoria generado con </w:t>
-      </w:r>
-      <w:proofErr w:type="spellStart"/>
-      <w:r>
-        <w:rPr>
-          <w:lang w:val="es-ES"/>
-        </w:rPr>
-        <w:t>Plotly</w:t>
-      </w:r>
-      <w:proofErr w:type="spellEnd"/>
+        <w:t>2. Imagen introductoria generado con Plotly</w:t>
+      </w:r>
     </w:p>
     <w:p>
       <w:pPr>
@@ -857,21 +857,7 @@
         <w:rPr>
           <w:lang w:val="es-ES"/>
         </w:rPr>
-        <w:t xml:space="preserve"> de manera artificial, los dos </w:t>
-      </w:r>
-      <w:proofErr w:type="spellStart"/>
-      <w:r>
-        <w:rPr>
-          <w:lang w:val="es-ES"/>
-        </w:rPr>
-        <w:t>datasets</w:t>
-      </w:r>
-      <w:proofErr w:type="spellEnd"/>
-      <w:r>
-        <w:rPr>
-          <w:lang w:val="es-ES"/>
-        </w:rPr>
-        <w:t xml:space="preserve"> asociados la </w:t>
+        <w:t xml:space="preserve"> de manera artificial, los dos datasets asociados la </w:t>
       </w:r>
       <w:r>
         <w:rPr>
@@ -979,19 +965,11 @@
         </w:rPr>
         <w:t xml:space="preserve">nuevos </w:t>
       </w:r>
-      <w:proofErr w:type="spellStart"/>
-      <w:r>
-        <w:rPr>
-          <w:lang w:val="es-ES"/>
-        </w:rPr>
-        <w:t>datasets</w:t>
-      </w:r>
-      <w:proofErr w:type="spellEnd"/>
-      <w:r>
-        <w:rPr>
-          <w:lang w:val="es-ES"/>
-        </w:rPr>
-        <w:t xml:space="preserve"> </w:t>
+      <w:r>
+        <w:rPr>
+          <w:lang w:val="es-ES"/>
+        </w:rPr>
+        <w:t xml:space="preserve">datasets </w:t>
       </w:r>
       <w:r>
         <w:rPr>
@@ -1028,21 +1006,7 @@
         <w:rPr>
           <w:lang w:val="es-ES"/>
         </w:rPr>
-        <w:t xml:space="preserve">13. Ejercicios (Genere ejercicios sugeridos con </w:t>
-      </w:r>
-      <w:proofErr w:type="spellStart"/>
-      <w:r>
-        <w:rPr>
-          <w:lang w:val="es-ES"/>
-        </w:rPr>
-        <w:t>dataset</w:t>
-      </w:r>
-      <w:proofErr w:type="spellEnd"/>
-      <w:r>
-        <w:rPr>
-          <w:lang w:val="es-ES"/>
-        </w:rPr>
-        <w:t xml:space="preserve"> artificiales nuevos)</w:t>
+        <w:t>13. Ejercicios (Genere ejercicios sugeridos con dataset artificiales nuevos)</w:t>
       </w:r>
     </w:p>
     <w:p>
@@ -1767,6 +1731,7 @@
   <w:style w:type="character" w:default="1" w:styleId="Fuentedeprrafopredeter">
     <w:name w:val="Default Paragraph Font"/>
     <w:uiPriority w:val="1"/>
+    <w:semiHidden/>
     <w:unhideWhenUsed/>
   </w:style>
   <w:style w:type="table" w:default="1" w:styleId="Tablanormal">

</xml_diff>

<commit_message>
clase sobre combinación lineal mejorada
</commit_message>
<xml_diff>
--- a/4_parciales/asignacion_modulos.docx
+++ b/4_parciales/asignacion_modulos.docx
@@ -244,70 +244,13 @@
               </w:rPr>
               <w:t xml:space="preserve"> y Gabriel Arenas Herazo</w:t>
             </w:r>
-          </w:p>
-        </w:tc>
-      </w:tr>
-      <w:tr>
-        <w:tc>
-          <w:tcPr>
-            <w:tcW w:w="4414" w:type="dxa"/>
-          </w:tcPr>
-          <w:p>
-            <w:pPr>
-              <w:jc w:val="center"/>
-              <w:rPr>
-                <w:b/>
-                <w:bCs/>
-                <w:lang w:val="es-ES"/>
-              </w:rPr>
-            </w:pPr>
             <w:r>
               <w:rPr>
                 <w:b/>
                 <w:bCs/>
                 <w:lang w:val="es-ES"/>
               </w:rPr>
-              <w:t>4</w:t>
-            </w:r>
-            <w:r>
-              <w:rPr>
-                <w:b/>
-                <w:bCs/>
-                <w:lang w:val="es-ES"/>
-              </w:rPr>
-              <w:t>: Independencia y dependencia lineal</w:t>
-            </w:r>
-          </w:p>
-        </w:tc>
-        <w:tc>
-          <w:tcPr>
-            <w:tcW w:w="4414" w:type="dxa"/>
-          </w:tcPr>
-          <w:p>
-            <w:pPr>
-              <w:jc w:val="center"/>
-              <w:rPr>
-                <w:b/>
-                <w:bCs/>
-                <w:u w:val="single"/>
-                <w:lang w:val="es-ES"/>
-              </w:rPr>
-            </w:pPr>
-            <w:r>
-              <w:rPr>
-                <w:b/>
-                <w:bCs/>
-                <w:lang w:val="es-ES"/>
-              </w:rPr>
-              <w:t xml:space="preserve">Yanine y </w:t>
-            </w:r>
-            <w:r>
-              <w:rPr>
-                <w:b/>
-                <w:bCs/>
-                <w:lang w:val="es-ES"/>
-              </w:rPr>
-              <w:t>Erlinda</w:t>
+              <w:t>, Francisco</w:t>
             </w:r>
           </w:p>
         </w:tc>
@@ -332,7 +275,7 @@
                 <w:bCs/>
                 <w:lang w:val="es-ES"/>
               </w:rPr>
-              <w:t>5</w:t>
+              <w:t>4</w:t>
             </w:r>
             <w:r>
               <w:rPr>
@@ -340,7 +283,7 @@
                 <w:bCs/>
                 <w:lang w:val="es-ES"/>
               </w:rPr>
-              <w:t>: Bases y Dimensión</w:t>
+              <w:t>: Independencia y dependencia lineal</w:t>
             </w:r>
           </w:p>
         </w:tc>
@@ -354,23 +297,7 @@
               <w:rPr>
                 <w:b/>
                 <w:bCs/>
-                <w:lang w:val="es-ES"/>
-              </w:rPr>
-            </w:pPr>
-          </w:p>
-        </w:tc>
-      </w:tr>
-      <w:tr>
-        <w:tc>
-          <w:tcPr>
-            <w:tcW w:w="4414" w:type="dxa"/>
-          </w:tcPr>
-          <w:p>
-            <w:pPr>
-              <w:jc w:val="center"/>
-              <w:rPr>
-                <w:b/>
-                <w:bCs/>
+                <w:u w:val="single"/>
                 <w:lang w:val="es-ES"/>
               </w:rPr>
             </w:pPr>
@@ -380,7 +307,7 @@
                 <w:bCs/>
                 <w:lang w:val="es-ES"/>
               </w:rPr>
-              <w:t>6</w:t>
+              <w:t xml:space="preserve">Yanine y </w:t>
             </w:r>
             <w:r>
               <w:rPr>
@@ -388,30 +315,23 @@
                 <w:bCs/>
                 <w:lang w:val="es-ES"/>
               </w:rPr>
-              <w:t>: Espacios asociados a una matriz</w:t>
+              <w:t>Erlinda</w:t>
             </w:r>
-          </w:p>
-        </w:tc>
-        <w:tc>
-          <w:tcPr>
-            <w:tcW w:w="4414" w:type="dxa"/>
-          </w:tcPr>
-          <w:p>
-            <w:pPr>
-              <w:jc w:val="center"/>
-              <w:rPr>
-                <w:b/>
-                <w:bCs/>
-                <w:lang w:val="es-ES"/>
-              </w:rPr>
-            </w:pPr>
             <w:r>
               <w:rPr>
                 <w:b/>
                 <w:bCs/>
                 <w:lang w:val="es-ES"/>
               </w:rPr>
-              <w:t>Gabriela</w:t>
+              <w:t>.</w:t>
+            </w:r>
+            <w:r>
+              <w:rPr>
+                <w:b/>
+                <w:bCs/>
+                <w:lang w:val="es-ES"/>
+              </w:rPr>
+              <w:t>(Recordarme que les debo el video)</w:t>
             </w:r>
           </w:p>
         </w:tc>
@@ -436,6 +356,126 @@
                 <w:bCs/>
                 <w:lang w:val="es-ES"/>
               </w:rPr>
+              <w:t>5</w:t>
+            </w:r>
+            <w:r>
+              <w:rPr>
+                <w:b/>
+                <w:bCs/>
+                <w:lang w:val="es-ES"/>
+              </w:rPr>
+              <w:t>: Bases y Dimensión</w:t>
+            </w:r>
+          </w:p>
+        </w:tc>
+        <w:tc>
+          <w:tcPr>
+            <w:tcW w:w="4414" w:type="dxa"/>
+          </w:tcPr>
+          <w:p>
+            <w:pPr>
+              <w:jc w:val="center"/>
+              <w:rPr>
+                <w:b/>
+                <w:bCs/>
+                <w:lang w:val="es-ES"/>
+              </w:rPr>
+            </w:pPr>
+            <w:r>
+              <w:rPr>
+                <w:b/>
+                <w:bCs/>
+                <w:lang w:val="es-ES"/>
+              </w:rPr>
+              <w:t xml:space="preserve">Daniel Cantillo </w:t>
+            </w:r>
+          </w:p>
+        </w:tc>
+      </w:tr>
+      <w:tr>
+        <w:tc>
+          <w:tcPr>
+            <w:tcW w:w="4414" w:type="dxa"/>
+          </w:tcPr>
+          <w:p>
+            <w:pPr>
+              <w:jc w:val="center"/>
+              <w:rPr>
+                <w:b/>
+                <w:bCs/>
+                <w:lang w:val="es-ES"/>
+              </w:rPr>
+            </w:pPr>
+            <w:r>
+              <w:rPr>
+                <w:b/>
+                <w:bCs/>
+                <w:lang w:val="es-ES"/>
+              </w:rPr>
+              <w:t>6</w:t>
+            </w:r>
+            <w:r>
+              <w:rPr>
+                <w:b/>
+                <w:bCs/>
+                <w:lang w:val="es-ES"/>
+              </w:rPr>
+              <w:t>: Espacios asociados a una matriz</w:t>
+            </w:r>
+          </w:p>
+        </w:tc>
+        <w:tc>
+          <w:tcPr>
+            <w:tcW w:w="4414" w:type="dxa"/>
+          </w:tcPr>
+          <w:p>
+            <w:pPr>
+              <w:jc w:val="center"/>
+              <w:rPr>
+                <w:b/>
+                <w:bCs/>
+                <w:lang w:val="es-ES"/>
+              </w:rPr>
+            </w:pPr>
+            <w:r>
+              <w:rPr>
+                <w:b/>
+                <w:bCs/>
+                <w:lang w:val="es-ES"/>
+              </w:rPr>
+              <w:t>Gabriela</w:t>
+            </w:r>
+            <w:r>
+              <w:rPr>
+                <w:b/>
+                <w:bCs/>
+                <w:lang w:val="es-ES"/>
+              </w:rPr>
+              <w:t>, Marisol y Abril</w:t>
+            </w:r>
+          </w:p>
+        </w:tc>
+      </w:tr>
+      <w:tr>
+        <w:tc>
+          <w:tcPr>
+            <w:tcW w:w="4414" w:type="dxa"/>
+          </w:tcPr>
+          <w:p>
+            <w:pPr>
+              <w:jc w:val="center"/>
+              <w:rPr>
+                <w:b/>
+                <w:bCs/>
+                <w:lang w:val="es-ES"/>
+              </w:rPr>
+            </w:pPr>
+            <w:r>
+              <w:rPr>
+                <w:b/>
+                <w:bCs/>
+                <w:lang w:val="es-ES"/>
+              </w:rPr>
               <w:t>7: Coordenadas y Cambio de Base</w:t>
             </w:r>
           </w:p>
@@ -581,123 +621,166 @@
     </w:p>
     <w:p>
       <w:pPr>
-        <w:rPr>
-          <w:b/>
-          <w:bCs/>
-          <w:lang w:val="es-ES"/>
-        </w:rPr>
-      </w:pPr>
-    </w:p>
-    <w:p>
-      <w:pPr>
-        <w:rPr>
-          <w:b/>
-          <w:bCs/>
-          <w:lang w:val="es-ES"/>
-        </w:rPr>
-      </w:pPr>
-    </w:p>
-    <w:p>
-      <w:pPr>
-        <w:rPr>
-          <w:b/>
-          <w:bCs/>
-          <w:lang w:val="es-ES"/>
-        </w:rPr>
-      </w:pPr>
-    </w:p>
-    <w:p>
-      <w:pPr>
-        <w:rPr>
-          <w:b/>
-          <w:bCs/>
-          <w:lang w:val="es-ES"/>
-        </w:rPr>
-      </w:pPr>
-    </w:p>
-    <w:p>
-      <w:pPr>
-        <w:rPr>
-          <w:b/>
-          <w:bCs/>
-          <w:lang w:val="es-ES"/>
-        </w:rPr>
-      </w:pPr>
-    </w:p>
-    <w:p>
-      <w:pPr>
-        <w:rPr>
-          <w:b/>
-          <w:bCs/>
-          <w:lang w:val="es-ES"/>
-        </w:rPr>
-      </w:pPr>
-    </w:p>
-    <w:p>
-      <w:pPr>
-        <w:rPr>
-          <w:b/>
-          <w:bCs/>
-          <w:lang w:val="es-ES"/>
-        </w:rPr>
-      </w:pPr>
-    </w:p>
-    <w:p>
-      <w:pPr>
-        <w:rPr>
-          <w:b/>
-          <w:bCs/>
-          <w:lang w:val="es-ES"/>
-        </w:rPr>
-      </w:pPr>
-    </w:p>
-    <w:p>
-      <w:pPr>
-        <w:rPr>
-          <w:b/>
-          <w:bCs/>
-          <w:lang w:val="es-ES"/>
-        </w:rPr>
-      </w:pPr>
-    </w:p>
-    <w:p>
-      <w:pPr>
-        <w:rPr>
-          <w:b/>
-          <w:bCs/>
-          <w:lang w:val="es-ES"/>
-        </w:rPr>
-      </w:pPr>
-    </w:p>
-    <w:p>
-      <w:pPr>
-        <w:rPr>
-          <w:b/>
-          <w:bCs/>
-          <w:lang w:val="es-ES"/>
-        </w:rPr>
-      </w:pPr>
-    </w:p>
-    <w:p>
-      <w:pPr>
-        <w:rPr>
-          <w:b/>
-          <w:bCs/>
-          <w:lang w:val="es-ES"/>
-        </w:rPr>
-      </w:pPr>
-    </w:p>
-    <w:p>
-      <w:pPr>
-        <w:rPr>
-          <w:lang w:val="es-ES"/>
-        </w:rPr>
-      </w:pPr>
-      <w:r>
-        <w:rPr>
-          <w:lang w:val="es-ES"/>
-        </w:rPr>
-        <w:lastRenderedPageBreak/>
+        <w:pStyle w:val="Prrafodelista"/>
+        <w:numPr>
+          <w:ilvl w:val="0"/>
+          <w:numId w:val="1"/>
+        </w:numPr>
+        <w:rPr>
+          <w:b/>
+          <w:bCs/>
+          <w:lang w:val="es-ES"/>
+        </w:rPr>
+      </w:pPr>
+      <w:r>
+        <w:rPr>
+          <w:b/>
+          <w:bCs/>
+          <w:lang w:val="es-ES"/>
+        </w:rPr>
+        <w:t xml:space="preserve">Entregar el video en quince días. </w:t>
+      </w:r>
+    </w:p>
+    <w:p>
+      <w:pPr>
+        <w:pStyle w:val="Prrafodelista"/>
+        <w:numPr>
+          <w:ilvl w:val="0"/>
+          <w:numId w:val="1"/>
+        </w:numPr>
+        <w:rPr>
+          <w:b/>
+          <w:bCs/>
+          <w:lang w:val="es-ES"/>
+        </w:rPr>
+      </w:pPr>
+      <w:r>
+        <w:rPr>
+          <w:b/>
+          <w:bCs/>
+          <w:lang w:val="es-ES"/>
+        </w:rPr>
+        <w:t xml:space="preserve">Ya vale dos casillas o el 40 %. </w:t>
+      </w:r>
+    </w:p>
+    <w:p>
+      <w:pPr>
+        <w:rPr>
+          <w:b/>
+          <w:bCs/>
+          <w:lang w:val="es-ES"/>
+        </w:rPr>
+      </w:pPr>
+    </w:p>
+    <w:p>
+      <w:pPr>
+        <w:rPr>
+          <w:b/>
+          <w:bCs/>
+          <w:lang w:val="es-ES"/>
+        </w:rPr>
+      </w:pPr>
+    </w:p>
+    <w:p>
+      <w:pPr>
+        <w:rPr>
+          <w:b/>
+          <w:bCs/>
+          <w:lang w:val="es-ES"/>
+        </w:rPr>
+      </w:pPr>
+    </w:p>
+    <w:p>
+      <w:pPr>
+        <w:rPr>
+          <w:b/>
+          <w:bCs/>
+          <w:lang w:val="es-ES"/>
+        </w:rPr>
+      </w:pPr>
+    </w:p>
+    <w:p>
+      <w:pPr>
+        <w:rPr>
+          <w:b/>
+          <w:bCs/>
+          <w:lang w:val="es-ES"/>
+        </w:rPr>
+      </w:pPr>
+    </w:p>
+    <w:p>
+      <w:pPr>
+        <w:rPr>
+          <w:b/>
+          <w:bCs/>
+          <w:lang w:val="es-ES"/>
+        </w:rPr>
+      </w:pPr>
+    </w:p>
+    <w:p>
+      <w:pPr>
+        <w:rPr>
+          <w:b/>
+          <w:bCs/>
+          <w:lang w:val="es-ES"/>
+        </w:rPr>
+      </w:pPr>
+    </w:p>
+    <w:p>
+      <w:pPr>
+        <w:rPr>
+          <w:b/>
+          <w:bCs/>
+          <w:lang w:val="es-ES"/>
+        </w:rPr>
+      </w:pPr>
+    </w:p>
+    <w:p>
+      <w:pPr>
+        <w:rPr>
+          <w:b/>
+          <w:bCs/>
+          <w:lang w:val="es-ES"/>
+        </w:rPr>
+      </w:pPr>
+    </w:p>
+    <w:p>
+      <w:pPr>
+        <w:rPr>
+          <w:b/>
+          <w:bCs/>
+          <w:lang w:val="es-ES"/>
+        </w:rPr>
+      </w:pPr>
+    </w:p>
+    <w:p>
+      <w:pPr>
+        <w:rPr>
+          <w:b/>
+          <w:bCs/>
+          <w:lang w:val="es-ES"/>
+        </w:rPr>
+      </w:pPr>
+    </w:p>
+    <w:p>
+      <w:pPr>
+        <w:rPr>
+          <w:b/>
+          <w:bCs/>
+          <w:lang w:val="es-ES"/>
+        </w:rPr>
+      </w:pPr>
+    </w:p>
+    <w:p>
+      <w:pPr>
+        <w:rPr>
+          <w:lang w:val="es-ES"/>
+        </w:rPr>
+      </w:pPr>
+      <w:r>
+        <w:rPr>
+          <w:lang w:val="es-ES"/>
+        </w:rPr>
         <w:t>Estructura de cada Módulo (Total de módulos: 22)</w:t>
       </w:r>
     </w:p>
@@ -731,8 +814,16 @@
         <w:rPr>
           <w:lang w:val="es-ES"/>
         </w:rPr>
-        <w:t>2. Imagen introductoria generado con Plotly</w:t>
-      </w:r>
+        <w:t xml:space="preserve">2. Imagen introductoria generado con </w:t>
+      </w:r>
+      <w:proofErr w:type="spellStart"/>
+      <w:r>
+        <w:rPr>
+          <w:lang w:val="es-ES"/>
+        </w:rPr>
+        <w:t>Plotly</w:t>
+      </w:r>
+      <w:proofErr w:type="spellEnd"/>
     </w:p>
     <w:p>
       <w:pPr>
@@ -857,7 +948,21 @@
         <w:rPr>
           <w:lang w:val="es-ES"/>
         </w:rPr>
-        <w:t xml:space="preserve"> de manera artificial, los dos datasets asociados la </w:t>
+        <w:t xml:space="preserve"> de manera artificial, los dos </w:t>
+      </w:r>
+      <w:proofErr w:type="spellStart"/>
+      <w:r>
+        <w:rPr>
+          <w:lang w:val="es-ES"/>
+        </w:rPr>
+        <w:t>datasets</w:t>
+      </w:r>
+      <w:proofErr w:type="spellEnd"/>
+      <w:r>
+        <w:rPr>
+          <w:lang w:val="es-ES"/>
+        </w:rPr>
+        <w:t xml:space="preserve"> asociados la </w:t>
       </w:r>
       <w:r>
         <w:rPr>
@@ -965,11 +1070,19 @@
         </w:rPr>
         <w:t xml:space="preserve">nuevos </w:t>
       </w:r>
-      <w:r>
-        <w:rPr>
-          <w:lang w:val="es-ES"/>
-        </w:rPr>
-        <w:t xml:space="preserve">datasets </w:t>
+      <w:proofErr w:type="spellStart"/>
+      <w:r>
+        <w:rPr>
+          <w:lang w:val="es-ES"/>
+        </w:rPr>
+        <w:t>datasets</w:t>
+      </w:r>
+      <w:proofErr w:type="spellEnd"/>
+      <w:r>
+        <w:rPr>
+          <w:lang w:val="es-ES"/>
+        </w:rPr>
+        <w:t xml:space="preserve"> </w:t>
       </w:r>
       <w:r>
         <w:rPr>
@@ -1006,7 +1119,21 @@
         <w:rPr>
           <w:lang w:val="es-ES"/>
         </w:rPr>
-        <w:t>13. Ejercicios (Genere ejercicios sugeridos con dataset artificiales nuevos)</w:t>
+        <w:t xml:space="preserve">13. Ejercicios (Genere ejercicios sugeridos con </w:t>
+      </w:r>
+      <w:proofErr w:type="spellStart"/>
+      <w:r>
+        <w:rPr>
+          <w:lang w:val="es-ES"/>
+        </w:rPr>
+        <w:t>dataset</w:t>
+      </w:r>
+      <w:proofErr w:type="spellEnd"/>
+      <w:r>
+        <w:rPr>
+          <w:lang w:val="es-ES"/>
+        </w:rPr>
+        <w:t xml:space="preserve"> artificiales nuevos)</w:t>
       </w:r>
     </w:p>
     <w:p>

</xml_diff>

<commit_message>
renombre de módulos en curso con mayor pertinencia
</commit_message>
<xml_diff>
--- a/4_parciales/asignacion_modulos.docx
+++ b/4_parciales/asignacion_modulos.docx
@@ -97,102 +97,6 @@
               <w:rPr>
                 <w:b/>
                 <w:bCs/>
-                <w:lang w:val="es-ES"/>
-              </w:rPr>
-            </w:pPr>
-            <w:r>
-              <w:rPr>
-                <w:b/>
-                <w:bCs/>
-                <w:lang w:val="es-ES"/>
-              </w:rPr>
-              <w:t>1</w:t>
-            </w:r>
-            <w:r>
-              <w:rPr>
-                <w:b/>
-                <w:bCs/>
-                <w:lang w:val="es-ES"/>
-              </w:rPr>
-              <w:t>: Espacios Vectoriales</w:t>
-            </w:r>
-          </w:p>
-        </w:tc>
-        <w:tc>
-          <w:tcPr>
-            <w:tcW w:w="4414" w:type="dxa"/>
-          </w:tcPr>
-          <w:p>
-            <w:pPr>
-              <w:jc w:val="center"/>
-              <w:rPr>
-                <w:b/>
-                <w:bCs/>
-                <w:lang w:val="es-ES"/>
-              </w:rPr>
-            </w:pPr>
-          </w:p>
-        </w:tc>
-      </w:tr>
-      <w:tr>
-        <w:tc>
-          <w:tcPr>
-            <w:tcW w:w="4414" w:type="dxa"/>
-          </w:tcPr>
-          <w:p>
-            <w:pPr>
-              <w:jc w:val="center"/>
-              <w:rPr>
-                <w:b/>
-                <w:bCs/>
-                <w:lang w:val="es-ES"/>
-              </w:rPr>
-            </w:pPr>
-            <w:r>
-              <w:rPr>
-                <w:b/>
-                <w:bCs/>
-                <w:lang w:val="es-ES"/>
-              </w:rPr>
-              <w:t>2</w:t>
-            </w:r>
-            <w:r>
-              <w:rPr>
-                <w:b/>
-                <w:bCs/>
-                <w:lang w:val="es-ES"/>
-              </w:rPr>
-              <w:t>: Subespacios</w:t>
-            </w:r>
-          </w:p>
-        </w:tc>
-        <w:tc>
-          <w:tcPr>
-            <w:tcW w:w="4414" w:type="dxa"/>
-          </w:tcPr>
-          <w:p>
-            <w:pPr>
-              <w:jc w:val="center"/>
-              <w:rPr>
-                <w:b/>
-                <w:bCs/>
-                <w:lang w:val="es-ES"/>
-              </w:rPr>
-            </w:pPr>
-          </w:p>
-        </w:tc>
-      </w:tr>
-      <w:tr>
-        <w:tc>
-          <w:tcPr>
-            <w:tcW w:w="4414" w:type="dxa"/>
-          </w:tcPr>
-          <w:p>
-            <w:pPr>
-              <w:jc w:val="center"/>
-              <w:rPr>
-                <w:b/>
-                <w:bCs/>
                 <w:u w:val="single"/>
                 <w:lang w:val="es-ES"/>
               </w:rPr>
@@ -372,54 +276,6 @@
                 <w:bCs/>
                 <w:lang w:val="es-ES"/>
               </w:rPr>
-              <w:t>5</w:t>
-            </w:r>
-            <w:r>
-              <w:rPr>
-                <w:b/>
-                <w:bCs/>
-                <w:lang w:val="es-ES"/>
-              </w:rPr>
-              <w:t>: Bases y Dimensión</w:t>
-            </w:r>
-          </w:p>
-        </w:tc>
-        <w:tc>
-          <w:tcPr>
-            <w:tcW w:w="4414" w:type="dxa"/>
-          </w:tcPr>
-          <w:p>
-            <w:pPr>
-              <w:jc w:val="center"/>
-              <w:rPr>
-                <w:b/>
-                <w:bCs/>
-                <w:lang w:val="es-ES"/>
-              </w:rPr>
-            </w:pPr>
-          </w:p>
-        </w:tc>
-      </w:tr>
-      <w:tr>
-        <w:tc>
-          <w:tcPr>
-            <w:tcW w:w="4414" w:type="dxa"/>
-          </w:tcPr>
-          <w:p>
-            <w:pPr>
-              <w:jc w:val="center"/>
-              <w:rPr>
-                <w:b/>
-                <w:bCs/>
-                <w:lang w:val="es-ES"/>
-              </w:rPr>
-            </w:pPr>
-            <w:r>
-              <w:rPr>
-                <w:b/>
-                <w:bCs/>
-                <w:lang w:val="es-ES"/>
-              </w:rPr>
               <w:t>6</w:t>
             </w:r>
             <w:r>
@@ -515,15 +371,7 @@
                 <w:bCs/>
                 <w:lang w:val="es-ES"/>
               </w:rPr>
-              <w:t xml:space="preserve">, </w:t>
-            </w:r>
-            <w:r>
-              <w:rPr>
-                <w:b/>
-                <w:bCs/>
-                <w:lang w:val="es-ES"/>
-              </w:rPr>
-              <w:t>Daniel Cantillo</w:t>
+              <w:t>, Daniel Cantillo</w:t>
             </w:r>
             <w:r>
               <w:rPr>
@@ -813,6 +661,7 @@
         <w:rPr>
           <w:lang w:val="es-ES"/>
         </w:rPr>
+        <w:lastRenderedPageBreak/>
         <w:t>Estructura de cada Módulo (Total de módulos: 22)</w:t>
       </w:r>
     </w:p>

</xml_diff>

<commit_message>
imagen introductoria módulo 4
</commit_message>
<xml_diff>
--- a/4_parciales/asignacion_modulos.docx
+++ b/4_parciales/asignacion_modulos.docx
@@ -452,7 +452,39 @@
           <w:bCs/>
           <w:lang w:val="es-ES"/>
         </w:rPr>
-        <w:t xml:space="preserve">Hacer el video completo mostrando que sabe manejas vectores y matrices con Python </w:t>
+        <w:t>Hacer el video completo mostrando que sabe manej</w:t>
+      </w:r>
+      <w:r>
+        <w:rPr>
+          <w:b/>
+          <w:bCs/>
+          <w:lang w:val="es-ES"/>
+        </w:rPr>
+        <w:t>ar</w:t>
+      </w:r>
+      <w:r>
+        <w:rPr>
+          <w:b/>
+          <w:bCs/>
+          <w:lang w:val="es-ES"/>
+        </w:rPr>
+        <w:t xml:space="preserve"> vectores y matrices con Python</w:t>
+      </w:r>
+      <w:r>
+        <w:rPr>
+          <w:b/>
+          <w:bCs/>
+          <w:lang w:val="es-ES"/>
+        </w:rPr>
+        <w:t xml:space="preserve">. </w:t>
+      </w:r>
+      <w:r>
+        <w:rPr>
+          <w:b/>
+          <w:bCs/>
+          <w:lang w:val="es-ES"/>
+        </w:rPr>
+        <w:t xml:space="preserve"> </w:t>
       </w:r>
     </w:p>
     <w:p>
@@ -518,7 +550,23 @@
           <w:bCs/>
           <w:lang w:val="es-ES"/>
         </w:rPr>
-        <w:t xml:space="preserve">Entregar el video en quince días. </w:t>
+        <w:t>Entregar el video en quince días</w:t>
+      </w:r>
+      <w:r>
+        <w:rPr>
+          <w:b/>
+          <w:bCs/>
+          <w:lang w:val="es-ES"/>
+        </w:rPr>
+        <w:t xml:space="preserve"> (19 de mayo: Entrega de Video y Exposición)</w:t>
+      </w:r>
+      <w:r>
+        <w:rPr>
+          <w:b/>
+          <w:bCs/>
+          <w:lang w:val="es-ES"/>
+        </w:rPr>
+        <w:t xml:space="preserve">. </w:t>
       </w:r>
     </w:p>
     <w:p>
@@ -661,7 +709,6 @@
         <w:rPr>
           <w:lang w:val="es-ES"/>
         </w:rPr>
-        <w:lastRenderedPageBreak/>
         <w:t>Estructura de cada Módulo (Total de módulos: 22)</w:t>
       </w:r>
     </w:p>
@@ -695,8 +742,16 @@
         <w:rPr>
           <w:lang w:val="es-ES"/>
         </w:rPr>
-        <w:t>2. Imagen introductoria generado con Plotly</w:t>
-      </w:r>
+        <w:t xml:space="preserve">2. Imagen introductoria generado con </w:t>
+      </w:r>
+      <w:proofErr w:type="spellStart"/>
+      <w:r>
+        <w:rPr>
+          <w:lang w:val="es-ES"/>
+        </w:rPr>
+        <w:t>Plotly</w:t>
+      </w:r>
+      <w:proofErr w:type="spellEnd"/>
     </w:p>
     <w:p>
       <w:pPr>
@@ -821,7 +876,21 @@
         <w:rPr>
           <w:lang w:val="es-ES"/>
         </w:rPr>
-        <w:t xml:space="preserve"> de manera artificial, los dos datasets asociados la </w:t>
+        <w:t xml:space="preserve"> de manera artificial, los dos </w:t>
+      </w:r>
+      <w:proofErr w:type="spellStart"/>
+      <w:r>
+        <w:rPr>
+          <w:lang w:val="es-ES"/>
+        </w:rPr>
+        <w:t>datasets</w:t>
+      </w:r>
+      <w:proofErr w:type="spellEnd"/>
+      <w:r>
+        <w:rPr>
+          <w:lang w:val="es-ES"/>
+        </w:rPr>
+        <w:t xml:space="preserve"> asociados la </w:t>
       </w:r>
       <w:r>
         <w:rPr>
@@ -929,11 +998,19 @@
         </w:rPr>
         <w:t xml:space="preserve">nuevos </w:t>
       </w:r>
-      <w:r>
-        <w:rPr>
-          <w:lang w:val="es-ES"/>
-        </w:rPr>
-        <w:t xml:space="preserve">datasets </w:t>
+      <w:proofErr w:type="spellStart"/>
+      <w:r>
+        <w:rPr>
+          <w:lang w:val="es-ES"/>
+        </w:rPr>
+        <w:t>datasets</w:t>
+      </w:r>
+      <w:proofErr w:type="spellEnd"/>
+      <w:r>
+        <w:rPr>
+          <w:lang w:val="es-ES"/>
+        </w:rPr>
+        <w:t xml:space="preserve"> </w:t>
       </w:r>
       <w:r>
         <w:rPr>
@@ -970,7 +1047,21 @@
         <w:rPr>
           <w:lang w:val="es-ES"/>
         </w:rPr>
-        <w:t>13. Ejercicios (Genere ejercicios sugeridos con dataset artificiales nuevos)</w:t>
+        <w:t xml:space="preserve">13. Ejercicios (Genere ejercicios sugeridos con </w:t>
+      </w:r>
+      <w:proofErr w:type="spellStart"/>
+      <w:r>
+        <w:rPr>
+          <w:lang w:val="es-ES"/>
+        </w:rPr>
+        <w:t>dataset</w:t>
+      </w:r>
+      <w:proofErr w:type="spellEnd"/>
+      <w:r>
+        <w:rPr>
+          <w:lang w:val="es-ES"/>
+        </w:rPr>
+        <w:t xml:space="preserve"> artificiales nuevos)</w:t>
       </w:r>
     </w:p>
     <w:p>

</xml_diff>

<commit_message>
cuaderno de francisco actualizado
</commit_message>
<xml_diff>
--- a/4_parciales/asignacion_modulos.docx
+++ b/4_parciales/asignacion_modulos.docx
@@ -146,14 +146,6 @@
                 <w:bCs/>
                 <w:lang w:val="es-ES"/>
               </w:rPr>
-              <w:t xml:space="preserve"> y Gabriel Arenas Herazo</w:t>
-            </w:r>
-            <w:r>
-              <w:rPr>
-                <w:b/>
-                <w:bCs/>
-                <w:lang w:val="es-ES"/>
-              </w:rPr>
               <w:t>, Francisco</w:t>
             </w:r>
           </w:p>
@@ -590,6 +582,400 @@
         </w:rPr>
         <w:t xml:space="preserve">Ya vale dos casillas o el 40 %. </w:t>
       </w:r>
+      <w:r>
+        <w:rPr>
+          <w:b/>
+          <w:bCs/>
+          <w:lang w:val="es-ES"/>
+        </w:rPr>
+        <w:t xml:space="preserve">  </w:t>
+      </w:r>
+    </w:p>
+    <w:p>
+      <w:pPr>
+        <w:rPr>
+          <w:b/>
+          <w:bCs/>
+          <w:lang w:val="es-ES"/>
+        </w:rPr>
+      </w:pPr>
+    </w:p>
+    <w:p>
+      <w:pPr>
+        <w:rPr>
+          <w:b/>
+          <w:bCs/>
+          <w:lang w:val="es-ES"/>
+        </w:rPr>
+      </w:pPr>
+    </w:p>
+    <w:p>
+      <w:pPr>
+        <w:rPr>
+          <w:b/>
+          <w:bCs/>
+          <w:lang w:val="es-ES"/>
+        </w:rPr>
+      </w:pPr>
+      <w:r>
+        <w:rPr>
+          <w:b/>
+          <w:bCs/>
+          <w:lang w:val="es-ES"/>
+        </w:rPr>
+        <w:t xml:space="preserve"># Clase sobre: Dependencia e Independencia Lineal, en el contexto de Ingeniería Agropecuaria y Administración de Empresas emulando la estructura de clase de Clara Mejía Laverde y utilizando los Lenguajes Python y Latex; y las redes sociales GitHub y YouTube con orientación a la Ciencia de Datos con Técnicas de Machine Learning y Deep Learning. </w:t>
+      </w:r>
+    </w:p>
+    <w:p>
+      <w:pPr>
+        <w:rPr>
+          <w:b/>
+          <w:bCs/>
+          <w:lang w:val="es-ES"/>
+        </w:rPr>
+      </w:pPr>
+    </w:p>
+    <w:p>
+      <w:pPr>
+        <w:rPr>
+          <w:b/>
+          <w:bCs/>
+          <w:lang w:val="es-ES"/>
+        </w:rPr>
+      </w:pPr>
+    </w:p>
+    <w:p>
+      <w:pPr>
+        <w:rPr>
+          <w:b/>
+          <w:bCs/>
+          <w:lang w:val="es-ES"/>
+        </w:rPr>
+      </w:pPr>
+    </w:p>
+    <w:p>
+      <w:pPr>
+        <w:rPr>
+          <w:b/>
+          <w:bCs/>
+          <w:lang w:val="es-ES"/>
+        </w:rPr>
+      </w:pPr>
+    </w:p>
+    <w:p>
+      <w:pPr>
+        <w:rPr>
+          <w:b/>
+          <w:bCs/>
+          <w:lang w:val="es-ES"/>
+        </w:rPr>
+      </w:pPr>
+    </w:p>
+    <w:p>
+      <w:pPr>
+        <w:rPr>
+          <w:b/>
+          <w:bCs/>
+          <w:lang w:val="es-ES"/>
+        </w:rPr>
+      </w:pPr>
+    </w:p>
+    <w:p>
+      <w:pPr>
+        <w:rPr>
+          <w:b/>
+          <w:bCs/>
+          <w:lang w:val="es-ES"/>
+        </w:rPr>
+      </w:pPr>
+      <w:r>
+        <w:rPr>
+          <w:b/>
+          <w:bCs/>
+          <w:lang w:val="es-ES"/>
+        </w:rPr>
+        <w:lastRenderedPageBreak/>
+        <w:t>Estructura de este Módulo 4 (Total de módulos: 22)</w:t>
+      </w:r>
+    </w:p>
+    <w:p>
+      <w:pPr>
+        <w:rPr>
+          <w:b/>
+          <w:bCs/>
+          <w:lang w:val="es-ES"/>
+        </w:rPr>
+      </w:pPr>
+    </w:p>
+    <w:p>
+      <w:pPr>
+        <w:rPr>
+          <w:b/>
+          <w:bCs/>
+          <w:lang w:val="es-ES"/>
+        </w:rPr>
+      </w:pPr>
+      <w:r>
+        <w:rPr>
+          <w:b/>
+          <w:bCs/>
+          <w:lang w:val="es-ES"/>
+        </w:rPr>
+        <w:t>1. Título</w:t>
+      </w:r>
+    </w:p>
+    <w:p>
+      <w:pPr>
+        <w:rPr>
+          <w:b/>
+          <w:bCs/>
+          <w:lang w:val="es-ES"/>
+        </w:rPr>
+      </w:pPr>
+      <w:r>
+        <w:rPr>
+          <w:b/>
+          <w:bCs/>
+          <w:lang w:val="es-ES"/>
+        </w:rPr>
+        <w:t xml:space="preserve">2. Imagen introductoria al tema de: "Dependencia e Independencia Lineal", generado con Plotly. </w:t>
+      </w:r>
+    </w:p>
+    <w:p>
+      <w:pPr>
+        <w:rPr>
+          <w:b/>
+          <w:bCs/>
+          <w:lang w:val="es-ES"/>
+        </w:rPr>
+      </w:pPr>
+      <w:r>
+        <w:rPr>
+          <w:b/>
+          <w:bCs/>
+          <w:lang w:val="es-ES"/>
+        </w:rPr>
+        <w:t xml:space="preserve">3. Describe el Contenido de este módulo. </w:t>
+      </w:r>
+    </w:p>
+    <w:p>
+      <w:pPr>
+        <w:rPr>
+          <w:b/>
+          <w:bCs/>
+          <w:lang w:val="es-ES"/>
+        </w:rPr>
+      </w:pPr>
+      <w:r>
+        <w:rPr>
+          <w:b/>
+          <w:bCs/>
+          <w:lang w:val="es-ES"/>
+        </w:rPr>
+        <w:t>4. Objetivos de aprendizaje</w:t>
+      </w:r>
+    </w:p>
+    <w:p>
+      <w:pPr>
+        <w:rPr>
+          <w:b/>
+          <w:bCs/>
+          <w:lang w:val="es-ES"/>
+        </w:rPr>
+      </w:pPr>
+      <w:r>
+        <w:rPr>
+          <w:b/>
+          <w:bCs/>
+          <w:lang w:val="es-ES"/>
+        </w:rPr>
+        <w:t>5. Preguntas Orientadoras</w:t>
+      </w:r>
+    </w:p>
+    <w:p>
+      <w:pPr>
+        <w:rPr>
+          <w:b/>
+          <w:bCs/>
+          <w:lang w:val="es-ES"/>
+        </w:rPr>
+      </w:pPr>
+      <w:r>
+        <w:rPr>
+          <w:b/>
+          <w:bCs/>
+          <w:lang w:val="es-ES"/>
+        </w:rPr>
+        <w:t>6. Introducción</w:t>
+      </w:r>
+    </w:p>
+    <w:p>
+      <w:pPr>
+        <w:rPr>
+          <w:b/>
+          <w:bCs/>
+          <w:lang w:val="es-ES"/>
+        </w:rPr>
+      </w:pPr>
+      <w:r>
+        <w:rPr>
+          <w:b/>
+          <w:bCs/>
+          <w:lang w:val="es-ES"/>
+        </w:rPr>
+        <w:t xml:space="preserve">7. Dos situaciones problemáticas de predicción de rendimiento agropecuario asociadas a Ciencia de Datos Agropecuarios o de Administración de Empresas y al tema del módulo en particular (Para el módulo 4: debes dar una situación donde se aplique el tema de: Dependencia e Independencia Lineal). Por ejemplo, datos asociados a mediciones en agricultura de precisión. </w:t>
+      </w:r>
+    </w:p>
+    <w:p>
+      <w:pPr>
+        <w:rPr>
+          <w:b/>
+          <w:bCs/>
+          <w:lang w:val="es-ES"/>
+        </w:rPr>
+      </w:pPr>
+      <w:r>
+        <w:rPr>
+          <w:b/>
+          <w:bCs/>
+          <w:lang w:val="es-ES"/>
+        </w:rPr>
+        <w:t xml:space="preserve">8. Genere, de manera artificial, los dos datasets asociados la </w:t>
+      </w:r>
+      <w:r>
+        <w:rPr>
+          <w:b/>
+          <w:bCs/>
+          <w:lang w:val="es-ES"/>
+        </w:rPr>
+        <w:t>situación</w:t>
+      </w:r>
+      <w:r>
+        <w:rPr>
+          <w:b/>
+          <w:bCs/>
+          <w:lang w:val="es-ES"/>
+        </w:rPr>
+        <w:t xml:space="preserve"> problemática de predicción de rendimiento agropecuario anterior. Mostrando como el tema de: Dependencia e Independencia Lineal, permite identificar la </w:t>
+      </w:r>
+      <w:r>
+        <w:rPr>
+          <w:b/>
+          <w:bCs/>
+          <w:lang w:val="es-ES"/>
+        </w:rPr>
+        <w:t>información</w:t>
+      </w:r>
+      <w:r>
+        <w:rPr>
+          <w:b/>
+          <w:bCs/>
+          <w:lang w:val="es-ES"/>
+        </w:rPr>
+        <w:t xml:space="preserve"> redundante y realizar la reducción dimensional que permita un mejor desempeño predictivo del modelo.  </w:t>
+      </w:r>
+    </w:p>
+    <w:p>
+      <w:pPr>
+        <w:rPr>
+          <w:b/>
+          <w:bCs/>
+          <w:lang w:val="es-ES"/>
+        </w:rPr>
+      </w:pPr>
+      <w:r>
+        <w:rPr>
+          <w:b/>
+          <w:bCs/>
+          <w:lang w:val="es-ES"/>
+        </w:rPr>
+        <w:t>9.  Definiciones asociadas al módulo respectivo (Para este cuaderno el módulo 6: debes dar las definiciones en lenguaje Látex asociadas al tema de: Dependencia e Independencia Lineal)</w:t>
+      </w:r>
+    </w:p>
+    <w:p>
+      <w:pPr>
+        <w:rPr>
+          <w:b/>
+          <w:bCs/>
+          <w:lang w:val="es-ES"/>
+        </w:rPr>
+      </w:pPr>
+      <w:r>
+        <w:rPr>
+          <w:b/>
+          <w:bCs/>
+          <w:lang w:val="es-ES"/>
+        </w:rPr>
+        <w:t>10. Ejemplos: (Genere ejemplos de aplicación de estas definiciones anteriores de este módulo a las dos situaciones anteriores)</w:t>
+      </w:r>
+    </w:p>
+    <w:p>
+      <w:pPr>
+        <w:rPr>
+          <w:b/>
+          <w:bCs/>
+          <w:lang w:val="es-ES"/>
+        </w:rPr>
+      </w:pPr>
+      <w:r>
+        <w:rPr>
+          <w:b/>
+          <w:bCs/>
+          <w:lang w:val="es-ES"/>
+        </w:rPr>
+        <w:t>11. Teoremas: (Genere los teoremas del álgebra lineal que facilitan el uso de los temas del módulo para la solución de la situación problemática.)</w:t>
+      </w:r>
+    </w:p>
+    <w:p>
+      <w:pPr>
+        <w:rPr>
+          <w:b/>
+          <w:bCs/>
+          <w:lang w:val="es-ES"/>
+        </w:rPr>
+      </w:pPr>
+      <w:r>
+        <w:rPr>
+          <w:b/>
+          <w:bCs/>
+          <w:lang w:val="es-ES"/>
+        </w:rPr>
+        <w:t>12. Ejemplos: (Genere ejemplos de aplicación de los teoremas para los datasets de las situaciones problemáticas del módulo)</w:t>
+      </w:r>
+    </w:p>
+    <w:p>
+      <w:pPr>
+        <w:rPr>
+          <w:b/>
+          <w:bCs/>
+          <w:lang w:val="es-ES"/>
+        </w:rPr>
+      </w:pPr>
+      <w:r>
+        <w:rPr>
+          <w:b/>
+          <w:bCs/>
+          <w:lang w:val="es-ES"/>
+        </w:rPr>
+        <w:t xml:space="preserve">13. Ejercicios (Genere ejercicios sugeridos con datasets artificiales nuevos) </w:t>
+      </w:r>
+    </w:p>
+    <w:p>
+      <w:pPr>
+        <w:rPr>
+          <w:b/>
+          <w:bCs/>
+          <w:lang w:val="es-ES"/>
+        </w:rPr>
+      </w:pPr>
+      <w:r>
+        <w:rPr>
+          <w:b/>
+          <w:bCs/>
+          <w:lang w:val="es-ES"/>
+        </w:rPr>
+        <w:t>14. Referentes Didácticos y del Álgebra Lineal que sustenten y apoyan esta propuesta de enseñanza.</w:t>
+      </w:r>
     </w:p>
     <w:p>
       <w:pPr>
@@ -742,16 +1128,8 @@
         <w:rPr>
           <w:lang w:val="es-ES"/>
         </w:rPr>
-        <w:t xml:space="preserve">2. Imagen introductoria generado con </w:t>
-      </w:r>
-      <w:proofErr w:type="spellStart"/>
-      <w:r>
-        <w:rPr>
-          <w:lang w:val="es-ES"/>
-        </w:rPr>
-        <w:t>Plotly</w:t>
-      </w:r>
-      <w:proofErr w:type="spellEnd"/>
+        <w:t>2. Imagen introductoria generado con Plotly</w:t>
+      </w:r>
     </w:p>
     <w:p>
       <w:pPr>
@@ -876,21 +1254,7 @@
         <w:rPr>
           <w:lang w:val="es-ES"/>
         </w:rPr>
-        <w:t xml:space="preserve"> de manera artificial, los dos </w:t>
-      </w:r>
-      <w:proofErr w:type="spellStart"/>
-      <w:r>
-        <w:rPr>
-          <w:lang w:val="es-ES"/>
-        </w:rPr>
-        <w:t>datasets</w:t>
-      </w:r>
-      <w:proofErr w:type="spellEnd"/>
-      <w:r>
-        <w:rPr>
-          <w:lang w:val="es-ES"/>
-        </w:rPr>
-        <w:t xml:space="preserve"> asociados la </w:t>
+        <w:t xml:space="preserve"> de manera artificial, los dos datasets asociados la </w:t>
       </w:r>
       <w:r>
         <w:rPr>
@@ -915,6 +1279,7 @@
         <w:rPr>
           <w:lang w:val="es-ES"/>
         </w:rPr>
+        <w:lastRenderedPageBreak/>
         <w:t xml:space="preserve">9.  Definiciones asociadas al módulo respectivo (Para este cuaderno el módulo </w:t>
       </w:r>
       <w:r>
@@ -998,19 +1363,11 @@
         </w:rPr>
         <w:t xml:space="preserve">nuevos </w:t>
       </w:r>
-      <w:proofErr w:type="spellStart"/>
-      <w:r>
-        <w:rPr>
-          <w:lang w:val="es-ES"/>
-        </w:rPr>
-        <w:t>datasets</w:t>
-      </w:r>
-      <w:proofErr w:type="spellEnd"/>
-      <w:r>
-        <w:rPr>
-          <w:lang w:val="es-ES"/>
-        </w:rPr>
-        <w:t xml:space="preserve"> </w:t>
+      <w:r>
+        <w:rPr>
+          <w:lang w:val="es-ES"/>
+        </w:rPr>
+        <w:t xml:space="preserve">datasets </w:t>
       </w:r>
       <w:r>
         <w:rPr>
@@ -1047,21 +1404,7 @@
         <w:rPr>
           <w:lang w:val="es-ES"/>
         </w:rPr>
-        <w:t xml:space="preserve">13. Ejercicios (Genere ejercicios sugeridos con </w:t>
-      </w:r>
-      <w:proofErr w:type="spellStart"/>
-      <w:r>
-        <w:rPr>
-          <w:lang w:val="es-ES"/>
-        </w:rPr>
-        <w:t>dataset</w:t>
-      </w:r>
-      <w:proofErr w:type="spellEnd"/>
-      <w:r>
-        <w:rPr>
-          <w:lang w:val="es-ES"/>
-        </w:rPr>
-        <w:t xml:space="preserve"> artificiales nuevos)</w:t>
+        <w:t>13. Ejercicios (Genere ejercicios sugeridos con dataset artificiales nuevos)</w:t>
       </w:r>
     </w:p>
     <w:p>

</xml_diff>